<commit_message>
Syllabus WT26/27: consistent presentation lengths, task section ordered by presentation, keep headings with text
Co-Authored-By: Claude Opus 5.5 <noreply@anthropic.com>
Claude-Session: https://claude.ai/code/session_01RkWScMhuRmEB4zppSmB7Ri
</commit_message>
<xml_diff>
--- a/WT26-27/Syllabus Business Projects WT26-27.docx
+++ b/WT26-27/Syllabus Business Projects WT26-27.docx
@@ -4,6 +4,7 @@
   <w:body>
     <w:p>
       <w:pPr>
+        <w:keepNext/>
         <w:spacing w:after="0" w:line="240" w:lineRule="auto"/>
         <w:jc w:val="center"/>
         <w:rPr>
@@ -27,24 +28,27 @@
     </w:p>
     <w:p>
       <w:pPr>
-        <w:spacing w:after="0" w:line="240" w:lineRule="auto"/>
-        <w:jc w:val="both"/>
-        <w:rPr>
-          <w:lang w:val="en-US"/>
-        </w:rPr>
-      </w:pPr>
-    </w:p>
-    <w:p>
-      <w:pPr>
-        <w:spacing w:after="0" w:line="240" w:lineRule="auto"/>
-        <w:jc w:val="both"/>
-        <w:rPr>
-          <w:lang w:val="en-US"/>
-        </w:rPr>
-      </w:pPr>
-    </w:p>
-    <w:p>
-      <w:pPr>
+        <w:keepNext/>
+        <w:spacing w:after="0" w:line="240" w:lineRule="auto"/>
+        <w:jc w:val="both"/>
+        <w:rPr>
+          <w:lang w:val="en-US"/>
+        </w:rPr>
+      </w:pPr>
+    </w:p>
+    <w:p>
+      <w:pPr>
+        <w:keepNext/>
+        <w:spacing w:after="0" w:line="240" w:lineRule="auto"/>
+        <w:jc w:val="both"/>
+        <w:rPr>
+          <w:lang w:val="en-US"/>
+        </w:rPr>
+      </w:pPr>
+    </w:p>
+    <w:p>
+      <w:pPr>
+        <w:keepNext/>
         <w:spacing w:after="0" w:line="240" w:lineRule="auto"/>
         <w:jc w:val="both"/>
         <w:rPr>
@@ -198,6 +202,7 @@
     </w:p>
     <w:p>
       <w:pPr>
+        <w:keepNext/>
         <w:spacing w:after="0" w:line="240" w:lineRule="auto"/>
         <w:jc w:val="both"/>
         <w:rPr>
@@ -298,6 +303,7 @@
     </w:p>
     <w:p>
       <w:pPr>
+        <w:keepNext/>
         <w:spacing w:after="0" w:line="240" w:lineRule="auto"/>
         <w:jc w:val="both"/>
         <w:rPr>
@@ -512,6 +518,7 @@
     </w:p>
     <w:p>
       <w:pPr>
+        <w:keepNext/>
         <w:spacing w:after="0" w:line="240" w:lineRule="auto"/>
         <w:jc w:val="both"/>
         <w:rPr>
@@ -564,6 +571,7 @@
     </w:p>
     <w:p>
       <w:pPr>
+        <w:keepNext/>
         <w:spacing w:after="0" w:line="240" w:lineRule="auto"/>
         <w:jc w:val="both"/>
         <w:rPr>
@@ -727,6 +735,7 @@
     </w:p>
     <w:p>
       <w:pPr>
+        <w:keepNext/>
         <w:spacing w:after="0" w:line="240" w:lineRule="auto"/>
         <w:jc w:val="both"/>
         <w:rPr>
@@ -744,6 +753,7 @@
     </w:p>
     <w:p>
       <w:pPr>
+        <w:keepNext/>
         <w:spacing w:after="0" w:line="240" w:lineRule="auto"/>
         <w:jc w:val="both"/>
         <w:rPr>
@@ -824,6 +834,7 @@
     </w:p>
     <w:p>
       <w:pPr>
+        <w:keepNext/>
         <w:spacing w:after="0" w:line="240" w:lineRule="auto"/>
         <w:jc w:val="both"/>
         <w:rPr>
@@ -839,6 +850,7 @@
     </w:p>
     <w:p>
       <w:pPr>
+        <w:keepNext/>
         <w:spacing w:after="0" w:line="240" w:lineRule="auto"/>
         <w:jc w:val="both"/>
         <w:rPr>
@@ -919,6 +931,7 @@
     </w:p>
     <w:p>
       <w:pPr>
+        <w:keepNext/>
         <w:spacing w:after="0" w:line="240" w:lineRule="auto"/>
         <w:jc w:val="both"/>
         <w:rPr>
@@ -938,6 +951,7 @@
     </w:p>
     <w:p>
       <w:pPr>
+        <w:keepNext/>
         <w:spacing w:after="0" w:line="240" w:lineRule="auto"/>
         <w:jc w:val="both"/>
         <w:rPr>
@@ -996,6 +1010,7 @@
     <w:p>
       <w:pPr>
         <w:pStyle w:val="ListParagraph"/>
+        <w:keepNext/>
         <w:numPr>
           <w:ilvl w:val="0"/>
           <w:numId w:val="7"/>
@@ -1013,32 +1028,24 @@
           <w:bCs/>
           <w:lang w:val="en-US"/>
         </w:rPr>
-        <w:t xml:space="preserve">Market Selection (Midterm presentation)</w:t>
+        <w:t xml:space="preserve">Content Presentation: Market Selection Tools</w:t>
       </w:r>
     </w:p>
     <w:p>
       <w:pPr>
         <w:pStyle w:val="ListParagraph"/>
-        <w:spacing w:after="0" w:line="240" w:lineRule="auto"/>
-        <w:rPr>
-          <w:lang w:val="en-US"/>
-        </w:rPr>
-      </w:pPr>
-      <w:r>
-        <w:rPr>
-          <w:lang w:val="en-US"/>
-        </w:rPr>
-        <w:t xml:space="preserve">All groups compare the same 5 to 6 South American countries, selected together with Julius Meinl, using the same set of criteria, for example:</w:t>
-      </w:r>
-    </w:p>
-    <w:p>
-      <w:pPr>
-        <w:pStyle w:val="ListParagraph"/>
-        <w:spacing w:after="0" w:line="240" w:lineRule="auto"/>
-        <w:rPr>
-          <w:lang w:val="en-US"/>
-        </w:rPr>
-      </w:pPr>
+        <w:keepNext/>
+        <w:spacing w:after="0" w:line="240" w:lineRule="auto"/>
+        <w:rPr>
+          <w:lang w:val="en-US"/>
+        </w:rPr>
+      </w:pPr>
+      <w:r>
+        <w:rPr>
+          <w:lang w:val="en-US"/>
+        </w:rPr>
+        <w:t xml:space="preserve">Before analyzing specific markets, each group reviews the tools companies use to screen, compare and select international markets. The presentation covers:</w:t>
+      </w:r>
     </w:p>
     <w:p>
       <w:pPr>
@@ -1051,7 +1058,7 @@
         <w:ind w:left="1434" w:hanging="357"/>
       </w:pPr>
       <w:r>
-        <w:t xml:space="preserve">Size of the premium coffee segment in hospitality (HoReCa) and retail</w:t>
+        <w:t xml:space="preserve">The theory behind market selection tools (e.g., scoring and weighting models, market attractiveness–competitive strength portfolios, clustering, distance frameworks)</w:t>
       </w:r>
     </w:p>
     <w:p>
@@ -1065,7 +1072,7 @@
         <w:ind w:left="1434" w:hanging="357"/>
       </w:pPr>
       <w:r>
-        <w:t xml:space="preserve">Tourism and international hotel presence</w:t>
+        <w:t xml:space="preserve">Real-world applications showing how companies actually use these tools</w:t>
       </w:r>
     </w:p>
     <w:p>
@@ -1079,7 +1086,97 @@
         <w:ind w:left="1434" w:hanging="357"/>
       </w:pPr>
       <w:r>
-        <w:t xml:space="preserve">Purchasing power and economic development</w:t>
+        <w:t xml:space="preserve">Typical pitfalls, such as data availability, subjective weighting or outdated indicators</w:t>
+      </w:r>
+    </w:p>
+    <w:p>
+      <w:pPr>
+        <w:pStyle w:val="ListParagraph"/>
+        <w:spacing w:after="0" w:line="240" w:lineRule="auto"/>
+        <w:rPr>
+          <w:lang w:val="en-US"/>
+        </w:rPr>
+      </w:pPr>
+    </w:p>
+    <w:p>
+      <w:pPr>
+        <w:spacing w:after="0" w:line="240" w:lineRule="auto"/>
+        <w:ind w:left="1080"/>
+        <w:rPr>
+          <w:lang w:val="en-US"/>
+        </w:rPr>
+      </w:pPr>
+      <w:r>
+        <w:rPr>
+          <w:lang w:val="en-US"/>
+        </w:rPr>
+        <w:t xml:space="preserve">Each group concludes by recommending the tool it considers most suitable for comparing South American markets for Julius Meinl and applies it in the midterm presentation.</w:t>
+      </w:r>
+    </w:p>
+    <w:p>
+      <w:pPr>
+        <w:spacing w:after="0" w:line="240" w:lineRule="auto"/>
+        <w:ind w:left="1080"/>
+        <w:rPr>
+          <w:lang w:val="en-US"/>
+        </w:rPr>
+      </w:pPr>
+    </w:p>
+    <w:p>
+      <w:pPr>
+        <w:pStyle w:val="ListParagraph"/>
+        <w:keepNext/>
+        <w:numPr>
+          <w:ilvl w:val="0"/>
+          <w:numId w:val="7"/>
+        </w:numPr>
+        <w:spacing w:after="0" w:line="240" w:lineRule="auto"/>
+        <w:ind w:left="360"/>
+        <w:rPr>
+          <w:b/>
+          <w:bCs/>
+          <w:lang w:val="en-US"/>
+        </w:rPr>
+      </w:pPr>
+      <w:r>
+        <w:rPr>
+          <w:b/>
+          <w:bCs/>
+          <w:lang w:val="en-US"/>
+        </w:rPr>
+        <w:t xml:space="preserve">Midterm Presentation: Market Selection and Competitor Analysis</w:t>
+      </w:r>
+    </w:p>
+    <w:p>
+      <w:pPr>
+        <w:keepNext/>
+        <w:spacing w:after="0" w:line="240" w:lineRule="auto"/>
+        <w:ind w:firstLine="720"/>
+        <w:rPr>
+          <w:u w:val="single"/>
+        </w:rPr>
+      </w:pPr>
+      <w:r>
+        <w:rPr>
+          <w:u w:val="single"/>
+        </w:rPr>
+        <w:t xml:space="preserve">Part A: Market selection</w:t>
+      </w:r>
+    </w:p>
+    <w:p>
+      <w:pPr>
+        <w:pStyle w:val="ListParagraph"/>
+        <w:keepNext/>
+        <w:spacing w:after="0" w:line="240" w:lineRule="auto"/>
+        <w:rPr>
+          <w:lang w:val="en-US"/>
+        </w:rPr>
+      </w:pPr>
+      <w:r>
+        <w:rPr>
+          <w:lang w:val="en-US"/>
+        </w:rPr>
+        <w:t xml:space="preserve">All groups compare the same 5 to 6 South American countries, selected together with Julius Meinl, using the same set of criteria, for example:</w:t>
       </w:r>
     </w:p>
     <w:p>
@@ -1093,7 +1190,7 @@
         <w:ind w:left="1434" w:hanging="357"/>
       </w:pPr>
       <w:r>
-        <w:t xml:space="preserve">Competitive landscape</w:t>
+        <w:t xml:space="preserve">Size of the premium coffee segment in hospitality (HoReCa) and retail</w:t>
       </w:r>
     </w:p>
     <w:p>
@@ -1107,7 +1204,7 @@
         <w:ind w:left="1434" w:hanging="357"/>
       </w:pPr>
       <w:r>
-        <w:t xml:space="preserve">Import conditions and regulatory environment</w:t>
+        <w:t xml:space="preserve">Tourism and international hotel presence</w:t>
       </w:r>
     </w:p>
     <w:p>
@@ -1121,6 +1218,48 @@
         <w:ind w:left="1434" w:hanging="357"/>
       </w:pPr>
       <w:r>
+        <w:t xml:space="preserve">Purchasing power and economic development</w:t>
+      </w:r>
+    </w:p>
+    <w:p>
+      <w:pPr>
+        <w:pStyle w:val="ListParagraph"/>
+        <w:numPr>
+          <w:ilvl w:val="0"/>
+          <w:numId w:val="8"/>
+        </w:numPr>
+        <w:spacing w:after="0" w:line="240" w:lineRule="auto"/>
+        <w:ind w:left="1434" w:hanging="357"/>
+      </w:pPr>
+      <w:r>
+        <w:t xml:space="preserve">Competitive landscape</w:t>
+      </w:r>
+    </w:p>
+    <w:p>
+      <w:pPr>
+        <w:pStyle w:val="ListParagraph"/>
+        <w:numPr>
+          <w:ilvl w:val="0"/>
+          <w:numId w:val="8"/>
+        </w:numPr>
+        <w:spacing w:after="0" w:line="240" w:lineRule="auto"/>
+        <w:ind w:left="1434" w:hanging="357"/>
+      </w:pPr>
+      <w:r>
+        <w:t xml:space="preserve">Import conditions and regulatory environment</w:t>
+      </w:r>
+    </w:p>
+    <w:p>
+      <w:pPr>
+        <w:pStyle w:val="ListParagraph"/>
+        <w:numPr>
+          <w:ilvl w:val="0"/>
+          <w:numId w:val="8"/>
+        </w:numPr>
+        <w:spacing w:after="0" w:line="240" w:lineRule="auto"/>
+        <w:ind w:left="1434" w:hanging="357"/>
+      </w:pPr>
+      <w:r>
         <w:t xml:space="preserve">Coffee culture and consumption habits</w:t>
       </w:r>
     </w:p>
@@ -1135,15 +1274,16 @@
     </w:p>
     <w:p>
       <w:pPr>
-        <w:spacing w:after="0" w:line="240" w:lineRule="auto"/>
-        <w:ind w:firstLine="720"/>
-        <w:rPr>
-          <w:u w:val="single"/>
-        </w:rPr>
-      </w:pPr>
-      <w:r>
-        <w:rPr>
-          <w:u w:val="single"/>
+        <w:pStyle w:val="ListParagraph"/>
+        <w:keepNext/>
+        <w:spacing w:after="0" w:line="240" w:lineRule="auto"/>
+        <w:rPr>
+          <w:lang w:val="en-US"/>
+        </w:rPr>
+      </w:pPr>
+      <w:r>
+        <w:rPr>
+          <w:lang w:val="en-US"/>
         </w:rPr>
         <w:t xml:space="preserve">Groups are expected to:</w:t>
       </w:r>
@@ -1226,7 +1366,7 @@
         <w:rPr>
           <w:lang w:val="en-US"/>
         </w:rPr>
-        <w:t xml:space="preserve">Different results between groups are explicitly welcome; there is no single right answer. After this phase, each group is assigned one market, ideally a different one per group, so that the results cover several countries.</w:t>
+        <w:t xml:space="preserve">Different results between groups are explicitly welcome; there is no single right answer. After this step, each group is assigned one market, ideally a different one per group, so that the results cover several countries.</w:t>
       </w:r>
     </w:p>
     <w:p>
@@ -1240,65 +1380,34 @@
     </w:p>
     <w:p>
       <w:pPr>
+        <w:keepNext/>
+        <w:spacing w:after="0" w:line="240" w:lineRule="auto"/>
+        <w:ind w:firstLine="720"/>
+        <w:rPr>
+          <w:u w:val="single"/>
+        </w:rPr>
+      </w:pPr>
+      <w:r>
+        <w:rPr>
+          <w:u w:val="single"/>
+        </w:rPr>
+        <w:t xml:space="preserve">Part B: Market and competitor analysis</w:t>
+      </w:r>
+    </w:p>
+    <w:p>
+      <w:pPr>
         <w:pStyle w:val="ListParagraph"/>
-        <w:numPr>
-          <w:ilvl w:val="0"/>
-          <w:numId w:val="7"/>
-        </w:numPr>
-        <w:spacing w:after="0" w:line="240" w:lineRule="auto"/>
-        <w:ind w:left="360"/>
-        <w:rPr>
-          <w:b/>
-          <w:bCs/>
-          <w:lang w:val="en-US"/>
-        </w:rPr>
-      </w:pPr>
-      <w:r>
-        <w:rPr>
-          <w:b/>
-          <w:bCs/>
-          <w:lang w:val="en-US"/>
-        </w:rPr>
-        <w:t xml:space="preserve">Market and Competitor Analysis (Midterm presentation)</w:t>
-      </w:r>
-    </w:p>
-    <w:p>
-      <w:pPr>
-        <w:pStyle w:val="ListParagraph"/>
-        <w:spacing w:after="0" w:line="240" w:lineRule="auto"/>
-        <w:rPr>
-          <w:lang w:val="en-US"/>
-        </w:rPr>
-      </w:pPr>
-      <w:r>
-        <w:rPr>
-          <w:lang w:val="en-US"/>
-        </w:rPr>
-        <w:t xml:space="preserve">Building on the market selection, this section requires a structured deep-dive into the assigned country. The objective is to develop a concrete picture of the coffee market, its competitors and its routes to market.</w:t>
-      </w:r>
-    </w:p>
-    <w:p>
-      <w:pPr>
-        <w:pStyle w:val="ListParagraph"/>
-        <w:spacing w:after="0" w:line="240" w:lineRule="auto"/>
-        <w:rPr>
-          <w:lang w:val="en-US"/>
-        </w:rPr>
-      </w:pPr>
-    </w:p>
-    <w:p>
-      <w:pPr>
-        <w:pStyle w:val="ListParagraph"/>
-        <w:spacing w:after="0" w:line="240" w:lineRule="auto"/>
-        <w:rPr>
-          <w:lang w:val="en-US"/>
-        </w:rPr>
-      </w:pPr>
-      <w:r>
-        <w:rPr>
-          <w:lang w:val="en-US"/>
-        </w:rPr>
-        <w:t xml:space="preserve">Students should analyze:</w:t>
+        <w:keepNext/>
+        <w:spacing w:after="0" w:line="240" w:lineRule="auto"/>
+        <w:rPr>
+          <w:lang w:val="en-US"/>
+        </w:rPr>
+      </w:pPr>
+      <w:r>
+        <w:rPr>
+          <w:lang w:val="en-US"/>
+        </w:rPr>
+        <w:t xml:space="preserve">Building on the market selection, each group conducts a structured deep-dive into its assigned country to develop a concrete picture of the coffee market, its competitors and its routes to market. Students should analyze:</w:t>
       </w:r>
     </w:p>
     <w:p>
@@ -1432,6 +1541,7 @@
     <w:p>
       <w:pPr>
         <w:pStyle w:val="ListParagraph"/>
+        <w:keepNext/>
         <w:numPr>
           <w:ilvl w:val="0"/>
           <w:numId w:val="7"/>
@@ -1447,22 +1557,23 @@
           <w:b/>
           <w:bCs/>
         </w:rPr>
-        <w:t xml:space="preserve">Marketing Implementation Plan (Final presentation)</w:t>
+        <w:t xml:space="preserve">Final Presentation: Marketing Implementation Plan</w:t>
       </w:r>
     </w:p>
     <w:p>
       <w:pPr>
         <w:pStyle w:val="ListParagraph"/>
-        <w:spacing w:after="0" w:line="240" w:lineRule="auto"/>
-        <w:rPr>
-          <w:lang w:val="en-US"/>
-        </w:rPr>
-      </w:pPr>
-      <w:r>
-        <w:rPr>
-          <w:lang w:val="en-US"/>
-        </w:rPr>
-        <w:t xml:space="preserve">Each group should conclude with a market entry and marketing plan for its assigned market. The plan describes not only how the brand is marketed, but also how Julius Meinl enters the market. It covers:</w:t>
+        <w:keepNext/>
+        <w:spacing w:after="0" w:line="240" w:lineRule="auto"/>
+        <w:rPr>
+          <w:lang w:val="en-US"/>
+        </w:rPr>
+      </w:pPr>
+      <w:r>
+        <w:rPr>
+          <w:lang w:val="en-US"/>
+        </w:rPr>
+        <w:t xml:space="preserve">Each group concludes with a market entry and marketing plan for its assigned market. The plan describes not only how the brand is marketed, but also how Julius Meinl enters the market. It covers:</w:t>
       </w:r>
     </w:p>
     <w:p>
@@ -1590,6 +1701,7 @@
     </w:p>
     <w:p>
       <w:pPr>
+        <w:keepNext/>
         <w:spacing w:after="0" w:line="240" w:lineRule="auto"/>
         <w:jc w:val="both"/>
         <w:rPr>
@@ -1633,6 +1745,7 @@
     </w:p>
     <w:p>
       <w:pPr>
+        <w:keepNext/>
         <w:rPr>
           <w:b/>
           <w:bCs/>
@@ -1660,6 +1773,9 @@
         <w:gridCol w:w="3822"/>
       </w:tblGrid>
       <w:tr>
+        <w:trPr>
+          <w:cantSplit/>
+        </w:trPr>
         <w:tc>
           <w:tcPr>
             <w:tcW w:w="1129" w:type="dxa"/>
@@ -1736,6 +1852,9 @@
         </w:tc>
       </w:tr>
       <w:tr>
+        <w:trPr>
+          <w:cantSplit/>
+        </w:trPr>
         <w:tc>
           <w:tcPr>
             <w:tcW w:w="1129" w:type="dxa"/>
@@ -1805,6 +1924,9 @@
         </w:tc>
       </w:tr>
       <w:tr>
+        <w:trPr>
+          <w:cantSplit/>
+        </w:trPr>
         <w:tc>
           <w:tcPr>
             <w:tcW w:w="1129" w:type="dxa"/>
@@ -1874,6 +1996,9 @@
         </w:tc>
       </w:tr>
       <w:tr>
+        <w:trPr>
+          <w:cantSplit/>
+        </w:trPr>
         <w:tc>
           <w:tcPr>
             <w:tcW w:w="1129" w:type="dxa"/>
@@ -1943,6 +2068,9 @@
         </w:tc>
       </w:tr>
       <w:tr>
+        <w:trPr>
+          <w:cantSplit/>
+        </w:trPr>
         <w:tc>
           <w:tcPr>
             <w:tcW w:w="1129" w:type="dxa"/>
@@ -2012,6 +2140,9 @@
         </w:tc>
       </w:tr>
       <w:tr>
+        <w:trPr>
+          <w:cantSplit/>
+        </w:trPr>
         <w:tc>
           <w:tcPr>
             <w:tcW w:w="1129" w:type="dxa"/>
@@ -2081,6 +2212,9 @@
         </w:tc>
       </w:tr>
       <w:tr>
+        <w:trPr>
+          <w:cantSplit/>
+        </w:trPr>
         <w:tc>
           <w:tcPr>
             <w:tcW w:w="1129" w:type="dxa"/>
@@ -2150,6 +2284,9 @@
         </w:tc>
       </w:tr>
       <w:tr>
+        <w:trPr>
+          <w:cantSplit/>
+        </w:trPr>
         <w:tc>
           <w:tcPr>
             <w:tcW w:w="1129" w:type="dxa"/>
@@ -2219,6 +2356,9 @@
         </w:tc>
       </w:tr>
       <w:tr>
+        <w:trPr>
+          <w:cantSplit/>
+        </w:trPr>
         <w:tc>
           <w:tcPr>
             <w:tcW w:w="1129" w:type="dxa"/>
@@ -2298,6 +2438,7 @@
     </w:p>
     <w:p>
       <w:pPr>
+        <w:keepNext/>
         <w:spacing w:after="0" w:line="240" w:lineRule="auto"/>
         <w:rPr>
           <w:b/>
@@ -2336,7 +2477,7 @@
           <w:bCs/>
           <w:lang w:val="en-US"/>
         </w:rPr>
-        <w:t xml:space="preserve">20 minutes</w:t>
+        <w:t xml:space="preserve">15 minutes</w:t>
       </w:r>
       <w:r>
         <w:rPr>
@@ -2397,6 +2538,7 @@
     </w:p>
     <w:p>
       <w:pPr>
+        <w:keepNext/>
         <w:spacing w:after="0" w:line="240" w:lineRule="auto"/>
         <w:rPr>
           <w:b/>
@@ -2453,20 +2595,21 @@
         <w:rPr>
           <w:lang w:val="en-US"/>
         </w:rPr>
-        <w:t xml:space="preserve">. The Excel file should contain your country comparison data and all your updated sources including links. Make sure that you select AND apply the appropriate market selection method. The presentation covers both the market selection across the 5 to 6 countries and the market and competitor analysis of your assigned country, and should end with a clear, justified recommendation. </w:t>
-      </w:r>
-    </w:p>
-    <w:p>
-      <w:pPr>
-        <w:spacing w:after="0" w:line="240" w:lineRule="auto"/>
-        <w:jc w:val="both"/>
-        <w:rPr>
-          <w:lang w:val="en-US"/>
-        </w:rPr>
-      </w:pPr>
-    </w:p>
-    <w:p>
-      <w:pPr>
+        <w:t xml:space="preserve">. The Excel file should contain your country comparison data and all your updated sources including links. Make sure that you select AND apply the appropriate market selection method. The presentation covers both the market selection across the 5 to 6 countries and the market and competitor analysis of your assigned country, and should end with a clear, justified recommendation. The presentation should not exceed 20 minutes. </w:t>
+      </w:r>
+    </w:p>
+    <w:p>
+      <w:pPr>
+        <w:spacing w:after="0" w:line="240" w:lineRule="auto"/>
+        <w:jc w:val="both"/>
+        <w:rPr>
+          <w:lang w:val="en-US"/>
+        </w:rPr>
+      </w:pPr>
+    </w:p>
+    <w:p>
+      <w:pPr>
+        <w:keepNext/>
         <w:spacing w:after="0" w:line="240" w:lineRule="auto"/>
         <w:rPr>
           <w:b/>
@@ -2503,7 +2646,7 @@
           <w:bCs/>
           <w:lang w:val="en-US"/>
         </w:rPr>
-        <w:t xml:space="preserve">20 minutes</w:t>
+        <w:t xml:space="preserve">25 minutes</w:t>
       </w:r>
       <w:r>
         <w:rPr>
@@ -2523,6 +2666,7 @@
     </w:p>
     <w:p>
       <w:pPr>
+        <w:keepNext/>
         <w:spacing w:after="0" w:line="240" w:lineRule="auto"/>
         <w:jc w:val="both"/>
         <w:rPr>
@@ -2565,6 +2709,7 @@
     </w:p>
     <w:p>
       <w:pPr>
+        <w:keepNext/>
         <w:spacing w:after="0" w:line="240" w:lineRule="auto"/>
         <w:rPr>
           <w:b/>
@@ -2607,6 +2752,7 @@
     </w:p>
     <w:p>
       <w:pPr>
+        <w:keepNext/>
         <w:spacing w:after="0" w:line="240" w:lineRule="auto"/>
         <w:jc w:val="both"/>
         <w:rPr>
@@ -2642,6 +2788,7 @@
     </w:p>
     <w:p>
       <w:pPr>
+        <w:keepNext/>
         <w:spacing w:after="0" w:line="240" w:lineRule="auto"/>
         <w:jc w:val="center"/>
         <w:rPr>
@@ -2666,15 +2813,17 @@
     </w:p>
     <w:p>
       <w:pPr>
-        <w:spacing w:after="0" w:line="240" w:lineRule="auto"/>
-        <w:jc w:val="both"/>
-        <w:rPr>
-          <w:lang w:val="en-US"/>
-        </w:rPr>
-      </w:pPr>
-    </w:p>
-    <w:p>
-      <w:pPr>
+        <w:keepNext/>
+        <w:spacing w:after="0" w:line="240" w:lineRule="auto"/>
+        <w:jc w:val="both"/>
+        <w:rPr>
+          <w:lang w:val="en-US"/>
+        </w:rPr>
+      </w:pPr>
+    </w:p>
+    <w:p>
+      <w:pPr>
+        <w:keepNext/>
         <w:tabs>
           <w:tab w:val="left" w:pos="6624"/>
         </w:tabs>
@@ -2698,6 +2847,7 @@
     </w:p>
     <w:p>
       <w:pPr>
+        <w:keepNext/>
         <w:jc w:val="both"/>
         <w:rPr>
           <w:sz w:val="22"/>
@@ -2923,6 +3073,7 @@
     </w:p>
     <w:p>
       <w:pPr>
+        <w:keepNext/>
         <w:tabs>
           <w:tab w:val="left" w:pos="2268"/>
         </w:tabs>
@@ -2946,6 +3097,7 @@
     </w:p>
     <w:p>
       <w:pPr>
+        <w:keepNext/>
         <w:tabs>
           <w:tab w:val="left" w:pos="2268"/>
         </w:tabs>
@@ -2984,6 +3136,9 @@
         <w:gridCol w:w="2835"/>
       </w:tblGrid>
       <w:tr>
+        <w:trPr>
+          <w:cantSplit/>
+        </w:trPr>
         <w:tc>
           <w:tcPr>
             <w:tcW w:w="5954" w:type="dxa"/>
@@ -3037,6 +3192,7 @@
       </w:tr>
       <w:tr>
         <w:trPr>
+          <w:cantSplit/>
           <w:trHeight w:val="435"/>
         </w:trPr>
         <w:tc>
@@ -3157,6 +3313,7 @@
       </w:tr>
       <w:tr>
         <w:trPr>
+          <w:cantSplit/>
           <w:trHeight w:val="435"/>
         </w:trPr>
         <w:tc>
@@ -3253,6 +3410,7 @@
       </w:tr>
       <w:tr>
         <w:trPr>
+          <w:cantSplit/>
           <w:trHeight w:val="435"/>
         </w:trPr>
         <w:tc>
@@ -3355,6 +3513,7 @@
       </w:tr>
       <w:tr>
         <w:trPr>
+          <w:cantSplit/>
           <w:trHeight w:val="435"/>
         </w:trPr>
         <w:tc>
@@ -3461,6 +3620,7 @@
       </w:tr>
       <w:tr>
         <w:trPr>
+          <w:cantSplit/>
           <w:trHeight w:val="435"/>
         </w:trPr>
         <w:tc>
@@ -3589,6 +3749,7 @@
       </w:tblGrid>
       <w:tr>
         <w:trPr>
+          <w:cantSplit/>
           <w:trHeight w:val="2856"/>
         </w:trPr>
         <w:tc>

</xml_diff>

<commit_message>
Syllabus WT26/27: remove sentence on group results; add PDF next to Word file
Co-Authored-By: Claude Opus 5.5 <noreply@anthropic.com>
Claude-Session: https://claude.ai/code/session_01RkWScMhuRmEB4zppSmB7Ri
</commit_message>
<xml_diff>
--- a/WT26-27/Syllabus Business Projects WT26-27.docx
+++ b/WT26-27/Syllabus Business Projects WT26-27.docx
@@ -1349,30 +1349,6 @@
       <w:pPr>
         <w:pStyle w:val="ListParagraph"/>
         <w:spacing w:after="0" w:line="240" w:lineRule="auto"/>
-        <w:rPr>
-          <w:lang w:val="en-US"/>
-        </w:rPr>
-      </w:pPr>
-    </w:p>
-    <w:p>
-      <w:pPr>
-        <w:spacing w:after="0" w:line="240" w:lineRule="auto"/>
-        <w:ind w:left="1080"/>
-        <w:rPr>
-          <w:lang w:val="en-US"/>
-        </w:rPr>
-      </w:pPr>
-      <w:r>
-        <w:rPr>
-          <w:lang w:val="en-US"/>
-        </w:rPr>
-        <w:t xml:space="preserve">Different results between groups are explicitly welcome; there is no single right answer. After this step, each group is assigned one market, ideally a different one per group, so that the results cover several countries.</w:t>
-      </w:r>
-    </w:p>
-    <w:p>
-      <w:pPr>
-        <w:spacing w:after="0" w:line="240" w:lineRule="auto"/>
-        <w:ind w:left="1080"/>
         <w:rPr>
           <w:lang w:val="en-US"/>
         </w:rPr>

</xml_diff>

<commit_message>
Syllabus WT26/27: name the six Latin American countries
Co-Authored-By: Claude Opus 5.5 <noreply@anthropic.com>
Claude-Session: https://claude.ai/code/session_01RkWScMhuRmEB4zppSmB7Ri
</commit_message>
<xml_diff>
--- a/WT26-27/Syllabus Business Projects WT26-27.docx
+++ b/WT26-27/Syllabus Business Projects WT26-27.docx
@@ -995,7 +995,7 @@
         <w:rPr>
           <w:lang w:val="en-US"/>
         </w:rPr>
-        <w:t xml:space="preserve">Julius Meinl regards South America as a potential future growth region, where it is currently not present or only marginally. The guiding question is therefore which South American markets are attractive for Julius Meinl, how market entry could look, and how the brand should be marketed. At the heart of the project lies one critical question: several South American countries grow and roast their own coffee and have a strong coffee culture. Why should cafés, hotels, retailers and consumers in such a country choose a coffee brand from Vienna, and who exactly would do so? A convincing market entry and marketing plan must answer this question.</w:t>
+        <w:t xml:space="preserve">Julius Meinl regards Latin America, covering both South America and Mexico, as a potential future growth region, where it is currently not present or only marginally. The guiding question is therefore which Latin American markets are attractive for Julius Meinl, how market entry could look, and how the brand should be marketed. At the heart of the project lies one critical question: several Latin American countries grow and roast their own coffee and have a strong coffee culture. Why should cafés, hotels, retailers and consumers in such a country choose a coffee brand from Vienna, and who exactly would do so? A convincing market entry and marketing plan must answer this question.</w:t>
       </w:r>
     </w:p>
     <w:p>
@@ -1110,7 +1110,7 @@
         <w:rPr>
           <w:lang w:val="en-US"/>
         </w:rPr>
-        <w:t xml:space="preserve">Each group concludes by recommending the tool it considers most suitable for comparing South American markets for Julius Meinl and applies it in the midterm presentation.</w:t>
+        <w:t xml:space="preserve">Each group concludes by recommending the tool it considers most suitable for comparing Latin American markets for Julius Meinl and applies it in the midterm presentation.</w:t>
       </w:r>
     </w:p>
     <w:p>
@@ -1176,7 +1176,7 @@
         <w:rPr>
           <w:lang w:val="en-US"/>
         </w:rPr>
-        <w:t xml:space="preserve">All groups compare the same 5 to 6 South American countries, selected together with Julius Meinl, using the same set of criteria, for example:</w:t>
+        <w:t xml:space="preserve">All groups compare the same six countries, selected together with Julius Meinl: Argentina, Brazil, Chile, Colombia, Mexico and Uruguay. The comparison uses the same set of criteria for all groups, for example:</w:t>
       </w:r>
     </w:p>
     <w:p>
@@ -2445,7 +2445,7 @@
         </w:rPr>
         <w:t xml:space="preserve">Your first presentation focuses on market selection tools. Working in teams, you will research and summarize the most relevant approaches used to screen, compare and select international markets (e.g., scoring and weighting models, market attractiveness–competitive strength portfolios, clustering, or distance frameworks). Your task is to cover three aspects: (1) the theory behind the tools, (2) real-world applications showing how companies actually use them, and (3) typical pitfalls such as data availability, subjective weighting, or outdated indicators. Highlight advantages and </w:t>
         <w:lastRenderedPageBreak/>
-        <w:t xml:space="preserve">limitations, and decide which tool you consider most suitable for comparing South American markets for Julius Meinl. Be sure to explain and justify your choice clearly. The presentation should not exceed </w:t>
+        <w:t xml:space="preserve">limitations, and decide which tool you consider most suitable for comparing Latin American markets for Julius Meinl. Be sure to explain and justify your choice clearly. The presentation should not exceed </w:t>
       </w:r>
       <w:r>
         <w:rPr>
@@ -2571,7 +2571,7 @@
         <w:rPr>
           <w:lang w:val="en-US"/>
         </w:rPr>
-        <w:t xml:space="preserve">. The Excel file should contain your country comparison data and all your updated sources including links. Make sure that you select AND apply the appropriate market selection method. The presentation covers both the market selection across the 5 to 6 countries and the market and competitor analysis of your assigned country, and should end with a clear, justified recommendation. The presentation should not exceed 20 minutes. </w:t>
+        <w:t xml:space="preserve">. The Excel file should contain your country comparison data and all your updated sources including links. Make sure that you select AND apply the appropriate market selection method. The presentation covers both the market selection across the six countries and the market and competitor analysis of your assigned country, and should end with a clear, justified recommendation. The presentation should not exceed 20 minutes. </w:t>
       </w:r>
     </w:p>
     <w:p>

</xml_diff>

<commit_message>
Syllabus and slide deck: final session, presentation and submission dates
Co-Authored-By: Claude Sonnet 5.5 <noreply@anthropic.com>
Claude-Session: https://claude.ai/code/session_01RkWScMhuRmEB4zppSmB7Ri
</commit_message>
<xml_diff>
--- a/WT26-27/Syllabus Business Projects WT26-27.docx
+++ b/WT26-27/Syllabus Business Projects WT26-27.docx
@@ -2401,70 +2401,98 @@
         <w:rPr>
           <w:lang w:val="en-US"/>
         </w:rPr>
-        <w:t xml:space="preserve">Your first presentation focuses on market selection tools. Working in teams, you will research and summarize the most relevant approaches used to screen, compare and select international markets (e.g., scoring and weighting models, market attractiveness–competitive strength portfolios, clustering, or distance frameworks). Your task is to cover three aspects: (1) the theory behind the tools, (2) real-world applications showing how companies actually use them, and (3) typical pitfalls such as data availability, subjective weighting, or outdated indicators. Highlight advantages and </w:t>
-        <w:lastRenderedPageBreak/>
-        <w:t xml:space="preserve">limitations, and decide which tool you consider most suitable for comparing Latin American markets for Julius Meinl. Be sure to explain and justify your choice clearly. The presentation should not exceed </w:t>
-      </w:r>
-      <w:r>
+        <w:t>Your first presentation (Monday 12 October 2026) focuses on market selection tools. Working in teams, you will research and summarize the most relevant approaches used to screen, compare and select international markets (e.g., scoring and weighting models, market attractiveness–competitive strength portfolios, clustering, or distance frameworks). Your task is to cover three aspects: (1) the theory behind the tools, (2) real-world applications showing how companies actually use them, and (3) typical pitfalls such as data availability, subjective weighting, or outdated indicators. Highlight advantages and limitations, and decide which tool you consider most suitable for comparing Latin American markets for Julius Meinl. Be sure to explain and justify your choice clearly. The presentation should not exceed 15 minutes and must be limited to 15 slides. Slides should be information-rich and include clear visualizations, charts, or tables wherever possible to support your arguments. All sources used must be documented in detail in a separate Excel sheet, which will be submitted alongside your presentation. Your goal is not only to demonstrate knowledge of existing models but also to critically evaluate them and communicate your reasoning in a structured way.</w:t>
+      </w:r>
+    </w:p>
+    <w:p>
+      <w:pPr>
+        <w:spacing w:after="0" w:line="240" w:lineRule="auto"/>
+        <w:rPr>
+          <w:lang w:val="en-US"/>
+        </w:rPr>
+      </w:pPr>
+    </w:p>
+    <w:p>
+      <w:pPr>
+        <w:keepNext/>
+        <w:spacing w:after="0" w:line="240" w:lineRule="auto"/>
         <w:rPr>
           <w:b/>
           <w:bCs/>
           <w:lang w:val="en-US"/>
         </w:rPr>
-        <w:t xml:space="preserve">15 minutes</w:t>
-      </w:r>
-      <w:r>
-        <w:rPr>
-          <w:lang w:val="en-US"/>
-        </w:rPr>
-        <w:t xml:space="preserve"> and must be limited to </w:t>
-      </w:r>
+      </w:pPr>
       <w:r>
         <w:rPr>
           <w:b/>
           <w:bCs/>
           <w:lang w:val="en-US"/>
         </w:rPr>
-        <w:t xml:space="preserve">15 slides</w:t>
-      </w:r>
-      <w:r>
-        <w:rPr>
-          <w:lang w:val="en-US"/>
-        </w:rPr>
-        <w:t xml:space="preserve">. Slides should be </w:t>
-      </w:r>
-      <w:r>
+        <w:t>Additional Information for Midterm Presentation</w:t>
+      </w:r>
+    </w:p>
+    <w:p>
+      <w:pPr>
+        <w:spacing w:after="0" w:line="240" w:lineRule="auto"/>
+        <w:jc w:val="both"/>
+        <w:rPr>
+          <w:lang w:val="en-US"/>
+        </w:rPr>
+      </w:pPr>
+      <w:r>
+        <w:rPr>
+          <w:lang w:val="en-US"/>
+        </w:rPr>
+        <w:t>For the midterm presentation on Monday 16 November 2026, each group is required to submit one Excel file and one presentation file. The Excel file should contain your country's data with all sources including links, your industry analysis and a list of the AI tools you used. The data of your country are also entered in the shared Google Sheet. The presentation covers the scoring of your allocated country on the common criteria and the industry analysis of that country, and should end with a clear, justified recommendation. The presentation should not exceed 20 minutes (20 slides plus appendix), followed by 10 minutes of discussion. Both files are due on Canvas on Monday 16 November 2026 at 8:00.</w:t>
+      </w:r>
+    </w:p>
+    <w:p>
+      <w:pPr>
+        <w:spacing w:after="0" w:line="240" w:lineRule="auto"/>
+        <w:jc w:val="both"/>
+        <w:rPr>
+          <w:lang w:val="en-US"/>
+        </w:rPr>
+      </w:pPr>
+    </w:p>
+    <w:p>
+      <w:pPr>
+        <w:keepNext/>
+        <w:spacing w:after="0" w:line="240" w:lineRule="auto"/>
         <w:rPr>
           <w:b/>
           <w:bCs/>
           <w:lang w:val="en-US"/>
         </w:rPr>
-        <w:t xml:space="preserve">information-rich</w:t>
-      </w:r>
-      <w:r>
-        <w:rPr>
-          <w:lang w:val="en-US"/>
-        </w:rPr>
-        <w:t xml:space="preserve"> and include clear visualizations, charts, or tables wherever possible to support your arguments. All sources used must be documented in detail in a </w:t>
-      </w:r>
+      </w:pPr>
       <w:r>
         <w:rPr>
           <w:b/>
           <w:bCs/>
           <w:lang w:val="en-US"/>
         </w:rPr>
-        <w:t xml:space="preserve">separate Excel sheet</w:t>
-      </w:r>
-      <w:r>
-        <w:rPr>
-          <w:lang w:val="en-US"/>
-        </w:rPr>
-        <w:t xml:space="preserve">, which will be submitted alongside your presentation. Your goal is not only to demonstrate knowledge of existing models but also to critically evaluate them and communicate your reasoning in a structured way.</w:t>
-      </w:r>
-    </w:p>
-    <w:p>
-      <w:pPr>
-        <w:spacing w:after="0" w:line="240" w:lineRule="auto"/>
+        <w:t>Final Presentation</w:t>
+      </w:r>
+    </w:p>
+    <w:p>
+      <w:pPr>
+        <w:spacing w:after="0" w:line="240" w:lineRule="auto"/>
+        <w:jc w:val="both"/>
+        <w:rPr>
+          <w:lang w:val="en-US"/>
+        </w:rPr>
+      </w:pPr>
+      <w:r>
+        <w:rPr>
+          <w:lang w:val="en-US"/>
+        </w:rPr>
+        <w:t>The final presentation takes place on Monday 7 December 2026 (08:00-11:00, TC.5.04) and should last no longer than 25 minutes and provide a clear summary of both the process and the outcomes of your project. Focus on presenting your marketing implementation plan for Julius Meinl, including a concrete set of communication measures (Do not forget the creative implementation).</w:t>
+      </w:r>
+    </w:p>
+    <w:p>
+      <w:pPr>
+        <w:spacing w:after="0" w:line="240" w:lineRule="auto"/>
+        <w:jc w:val="both"/>
         <w:rPr>
           <w:lang w:val="en-US"/>
         </w:rPr>
@@ -2474,6 +2502,7 @@
       <w:pPr>
         <w:keepNext/>
         <w:spacing w:after="0" w:line="240" w:lineRule="auto"/>
+        <w:jc w:val="both"/>
         <w:rPr>
           <w:b/>
           <w:bCs/>
@@ -2486,28 +2515,27 @@
           <w:bCs/>
           <w:lang w:val="en-US"/>
         </w:rPr>
-        <w:t>Additional Information for Midterm Presentation</w:t>
-      </w:r>
-    </w:p>
-    <w:p>
-      <w:pPr>
-        <w:spacing w:after="0" w:line="240" w:lineRule="auto"/>
-        <w:jc w:val="both"/>
-        <w:rPr>
-          <w:lang w:val="en-US"/>
-        </w:rPr>
-      </w:pPr>
-      <w:r>
-        <w:rPr>
-          <w:lang w:val="en-US"/>
-        </w:rPr>
-        <w:t>For the midterm presentation, each group is required to submit one Excel file and one presentation file. The Excel file should contain your country's data with all sources including links, your industry analysis and a list of the AI tools you used. The data of your country are also entered in the shared Google Sheet. The presentation covers the scoring of your allocated country on the common criteria and the industry analysis of that country, and should end with a clear, justified recommendation. The presentation should not exceed 20 minutes (20 slides plus appendix), followed by 10 minutes of discussion. Both files are due on Canvas on Monday 16 November 2026 at 8:00.</w:t>
-      </w:r>
-    </w:p>
-    <w:p>
-      <w:pPr>
-        <w:spacing w:after="0" w:line="240" w:lineRule="auto"/>
-        <w:jc w:val="both"/>
+        <w:t>The Use of AI</w:t>
+      </w:r>
+    </w:p>
+    <w:p>
+      <w:pPr>
+        <w:spacing w:after="0" w:line="240" w:lineRule="auto"/>
+        <w:jc w:val="both"/>
+        <w:rPr>
+          <w:lang w:val="en-US"/>
+        </w:rPr>
+      </w:pPr>
+      <w:r>
+        <w:rPr>
+          <w:lang w:val="en-US"/>
+        </w:rPr>
+        <w:t xml:space="preserve">You are explicitly encouraged to use (Generative) AI tools. Please make sure that you tell a rich story when you do your presentations. Be honest and list all tools which you have used. You will be graded on the quality, innovativeness and variety of your sources.</w:t>
+      </w:r>
+    </w:p>
+    <w:p>
+      <w:pPr>
+        <w:spacing w:after="0" w:line="240" w:lineRule="auto"/>
         <w:rPr>
           <w:lang w:val="en-US"/>
         </w:rPr>
@@ -2529,150 +2557,50 @@
           <w:bCs/>
           <w:lang w:val="en-US"/>
         </w:rPr>
-        <w:t>Final Presentation</w:t>
-      </w:r>
-    </w:p>
-    <w:p>
-      <w:pPr>
-        <w:spacing w:after="0" w:line="240" w:lineRule="auto"/>
-        <w:jc w:val="both"/>
-        <w:rPr>
-          <w:lang w:val="en-US"/>
-        </w:rPr>
-      </w:pPr>
-      <w:r>
-        <w:rPr>
-          <w:lang w:val="en-US"/>
-        </w:rPr>
-        <w:t xml:space="preserve">The final presentation should last no longer than </w:t>
-      </w:r>
-      <w:r>
+        <w:t>Self-reflection</w:t>
+      </w:r>
+    </w:p>
+    <w:p>
+      <w:pPr>
+        <w:spacing w:after="0" w:line="240" w:lineRule="auto"/>
+        <w:jc w:val="both"/>
+        <w:rPr>
+          <w:lang w:val="en-US"/>
+        </w:rPr>
+      </w:pPr>
+      <w:r>
+        <w:rPr>
+          <w:lang w:val="en-US"/>
+        </w:rPr>
+        <w:t>Students need to write one page answering the following questions: 1) What have you learned? 2) What did you like? And 3) What can be improved? Submissions are made via Canvas until one week after the last session (Monday 14 December 2026).</w:t>
+      </w:r>
+    </w:p>
+    <w:p>
+      <w:pPr>
+        <w:spacing w:after="0" w:line="240" w:lineRule="auto"/>
+        <w:jc w:val="both"/>
+        <w:rPr>
+          <w:lang w:val="en-US"/>
+        </w:rPr>
+      </w:pPr>
+    </w:p>
+    <w:p>
+      <w:pPr>
+        <w:keepNext/>
+        <w:spacing w:after="0" w:line="240" w:lineRule="auto"/>
+        <w:jc w:val="both"/>
         <w:rPr>
           <w:b/>
           <w:bCs/>
           <w:lang w:val="en-US"/>
         </w:rPr>
-        <w:t xml:space="preserve">25 minutes</w:t>
-      </w:r>
-      <w:r>
-        <w:rPr>
-          <w:lang w:val="en-US"/>
-        </w:rPr>
-        <w:t xml:space="preserve"> and provide a clear summary of both the process and the outcomes of your project. Focus on presenting your marketing implementation plan for Julius Meinl, including a concrete set of communication measures (Do not forget the creative implementation).</w:t>
-      </w:r>
-    </w:p>
-    <w:p>
-      <w:pPr>
-        <w:spacing w:after="0" w:line="240" w:lineRule="auto"/>
-        <w:jc w:val="both"/>
-        <w:rPr>
-          <w:lang w:val="en-US"/>
-        </w:rPr>
-      </w:pPr>
-    </w:p>
-    <w:p>
-      <w:pPr>
-        <w:keepNext/>
-        <w:spacing w:after="0" w:line="240" w:lineRule="auto"/>
-        <w:jc w:val="both"/>
+      </w:pPr>
+      <w:r>
         <w:rPr>
           <w:b/>
           <w:bCs/>
           <w:lang w:val="en-US"/>
         </w:rPr>
-      </w:pPr>
-      <w:r>
-        <w:rPr>
-          <w:b/>
-          <w:bCs/>
-          <w:lang w:val="en-US"/>
-        </w:rPr>
-        <w:t>The Use of AI</w:t>
-      </w:r>
-    </w:p>
-    <w:p>
-      <w:pPr>
-        <w:spacing w:after="0" w:line="240" w:lineRule="auto"/>
-        <w:jc w:val="both"/>
-        <w:rPr>
-          <w:lang w:val="en-US"/>
-        </w:rPr>
-      </w:pPr>
-      <w:r>
-        <w:rPr>
-          <w:lang w:val="en-US"/>
-        </w:rPr>
-        <w:t xml:space="preserve">You are explicitly encouraged to use (Generative) AI tools. Please make sure that you tell a rich story when you do your presentations. Be honest and list all tools which you have used. You will be graded on the quality, innovativeness and variety of your sources.</w:t>
-      </w:r>
-    </w:p>
-    <w:p>
-      <w:pPr>
-        <w:spacing w:after="0" w:line="240" w:lineRule="auto"/>
-        <w:rPr>
-          <w:lang w:val="en-US"/>
-        </w:rPr>
-      </w:pPr>
-    </w:p>
-    <w:p>
-      <w:pPr>
-        <w:keepNext/>
-        <w:spacing w:after="0" w:line="240" w:lineRule="auto"/>
-        <w:rPr>
-          <w:b/>
-          <w:bCs/>
-          <w:lang w:val="en-US"/>
-        </w:rPr>
-      </w:pPr>
-      <w:r>
-        <w:rPr>
-          <w:b/>
-          <w:bCs/>
-          <w:lang w:val="en-US"/>
-        </w:rPr>
-        <w:t>Self-reflection</w:t>
-      </w:r>
-    </w:p>
-    <w:p>
-      <w:pPr>
-        <w:spacing w:after="0" w:line="240" w:lineRule="auto"/>
-        <w:jc w:val="both"/>
-        <w:rPr>
-          <w:lang w:val="en-US"/>
-        </w:rPr>
-      </w:pPr>
-      <w:r>
-        <w:rPr>
-          <w:lang w:val="en-US"/>
-        </w:rPr>
-        <w:t>Students need to write one page answering the following questions: 1) What have you learned? 2) What did you like? And 3) What can be improved? Submissions are made via Canvas until one week after the last session.</w:t>
-      </w:r>
-    </w:p>
-    <w:p>
-      <w:pPr>
-        <w:spacing w:after="0" w:line="240" w:lineRule="auto"/>
-        <w:jc w:val="both"/>
-        <w:rPr>
-          <w:lang w:val="en-US"/>
-        </w:rPr>
-      </w:pPr>
-    </w:p>
-    <w:p>
-      <w:pPr>
-        <w:keepNext/>
-        <w:spacing w:after="0" w:line="240" w:lineRule="auto"/>
-        <w:jc w:val="both"/>
-        <w:rPr>
-          <w:b/>
-          <w:bCs/>
-          <w:lang w:val="en-US"/>
-        </w:rPr>
-      </w:pPr>
-      <w:r>
-        <w:rPr>
-          <w:b/>
-          <w:bCs/>
-          <w:lang w:val="en-US"/>
-        </w:rPr>
         <w:t>Peer Review</w:t>
       </w:r>
     </w:p>
@@ -2688,8 +2616,7 @@
         <w:rPr>
           <w:lang w:val="en-US"/>
         </w:rPr>
-        <w:t>Students need to review the engagement and performance of their group mates based on the following form. Submissions are made via Canvas until one week after the last session.</w:t>
-        <w:br w:type="page"/>
+        <w:t>Students need to review the engagement and performance of their group mates based on the following form. Submissions are made via Canvas until one week after the last session (Monday 14 December 2026).</w:t>
       </w:r>
     </w:p>
     <w:p>

</xml_diff>

<commit_message>
Syllabus and slide deck: align Part A, Part B and midterm hand-in with the brief
Co-Authored-By: Claude Sonnet 5.5 <noreply@anthropic.com>
Claude-Session: https://claude.ai/code/session_01RkWScMhuRmEB4zppSmB7Ri
</commit_message>
<xml_diff>
--- a/WT26-27/Syllabus Business Projects WT26-27.docx
+++ b/WT26-27/Syllabus Business Projects WT26-27.docx
@@ -1134,7 +1134,7 @@
         <w:rPr>
           <w:lang w:val="en-US"/>
         </w:rPr>
-        <w:t>All groups score the same six countries, selected together with Julius Meinl: Argentina, Brazil, Chile, Colombia, Mexico and Uruguay. Each group is allocated one country (Group 1: Argentina, Group 2: Chile, Group 3: Mexico, Group 4: Colombia, Group 5: Uruguay, Group 6: Brazil) and collects its data. The scoring uses one set of criteria and one set of weights for all groups. The criteria are grouped by the six PESTEL dimensions, and the weights are fixed upfront by the instructor. All groups enter their data in a shared Google Sheet. The dimensions are:</w:t>
+        <w:t>All groups score the same six countries, selected together with Julius Meinl: Argentina, Brazil, Chile, Colombia, Mexico and Uruguay. Each group is allocated one country (Group 1: Argentina, Group 2: Chile, Group 3: Mexico, Group 4: Colombia, Group 5: Uruguay, Group 6: Brazil). The scoring is organised along the six PESTEL dimensions. First, each group searches for 45 criteria (5 political, 10 economic, 10 social, 10 technological, 5 environmental, 5 legal) with a source for each, by session 3 on Monday 19 October 2026. The instructor merges the proposals of all groups and selects the common criteria. The weights of the dimensions are fixed upfront by the instructor. Each group then enters only the numbers of its own country in a shared Google Sheet, which normalises the data and calculates scores and ranks automatically. The dimensions are:</w:t>
       </w:r>
     </w:p>
     <w:p>
@@ -1148,7 +1148,7 @@
         <w:ind w:left="1434" w:hanging="357"/>
       </w:pPr>
       <w:r>
-        <w:t>Political: political stability, trade agreement with the EU</w:t>
+        <w:t>Political: stability, governance and trade policy</w:t>
       </w:r>
     </w:p>
     <w:p>
@@ -1162,7 +1162,7 @@
         <w:ind w:left="1434" w:hanging="357"/>
       </w:pPr>
       <w:r>
-        <w:t>Economic: purchasing power, household consumption, inflation, import tariff</w:t>
+        <w:t>Economic: size, growth, purchasing power and trade conditions</w:t>
       </w:r>
     </w:p>
     <w:p>
@@ -1176,7 +1176,7 @@
         <w:ind w:left="1434" w:hanging="357"/>
       </w:pPr>
       <w:r>
-        <w:t>Social: coffee consumption and cafe culture, tourism</w:t>
+        <w:t>Social: demographics, consumption habits, coffee culture and tourism</w:t>
       </w:r>
     </w:p>
     <w:p>
@@ -1190,7 +1190,7 @@
         <w:ind w:left="1434" w:hanging="357"/>
       </w:pPr>
       <w:r>
-        <w:t>Technological: digital reach and logistics performance</w:t>
+        <w:t>Technological: digital and logistics infrastructure, how people shop and pay</w:t>
       </w:r>
     </w:p>
     <w:p>
@@ -1204,7 +1204,7 @@
         <w:ind w:left="1434" w:hanging="357"/>
       </w:pPr>
       <w:r>
-        <w:t>Environmental: demand for certified and sustainable coffee</w:t>
+        <w:t>Environmental: climate, sustainability expectations and supply risks</w:t>
       </w:r>
     </w:p>
     <w:p>
@@ -1218,7 +1218,7 @@
         <w:ind w:left="1434" w:hanging="357"/>
       </w:pPr>
       <w:r>
-        <w:t>Legal: regulatory quality, product and labelling requirements</w:t>
+        <w:t>Legal: rules for importing and selling, regulation and its enforcement</w:t>
       </w:r>
     </w:p>
     <w:p>
@@ -1262,7 +1262,7 @@
         <w:rPr>
           <w:lang w:val="en-US"/>
         </w:rPr>
-        <w:t>Collect and document the data of the allocated country, including year and source link for every value</w:t>
+        <w:t>Enter the numbers of the allocated country in the shared Google Sheet, with the year and a source link for every value</w:t>
       </w:r>
     </w:p>
     <w:p>
@@ -1341,7 +1341,7 @@
         <w:rPr>
           <w:lang w:val="en-US"/>
         </w:rPr>
-        <w:t>Each group searches for information and statistics on the coffee industry in its allocated country and presents them. Students should report the key figures for:</w:t>
+        <w:t>Each group searches for information and statistics on the coffee industry in its allocated country and presents them. All numbers are presented in the slides, and a source list documents every source. Students should report the key figures for:</w:t>
       </w:r>
     </w:p>
     <w:p>
@@ -2443,7 +2443,7 @@
         <w:rPr>
           <w:lang w:val="en-US"/>
         </w:rPr>
-        <w:t>For the midterm presentation on Monday 16 November 2026, each group is required to submit one Excel file and one presentation file. The Excel file should contain your country's data with all sources including links, your industry analysis and a list of the AI tools you used. The data of your country are also entered in the shared Google Sheet. The presentation covers the scoring of your allocated country on the common criteria and the industry analysis of that country, and should end with a clear, justified recommendation. The presentation should not exceed 20 minutes (20 slides plus appendix), followed by 10 minutes of discussion. Both files are due on Canvas on Monday 16 November 2026 at 8:00.</w:t>
+        <w:t>For the midterm presentation on Monday 16 November 2026, each group is required to submit one Excel file and one presentation file. The Excel file should contain your country's data with all sources including links, the source list of your industry analysis (every number on your industry slides) and a list of the AI tools you used. The presentation covers the scoring of your allocated country and the industry analysis of that country, and should end with a clear, justified recommendation. The presentation should not exceed 20 minutes (20 slides plus appendix), followed by 10 minutes of discussion. Both files are due on Canvas on Monday 16 November 2026 at 8:00. The midterm is assessed on fit to the case, Part A (scoring method), Part B (industry analysis), insights and recommendation, presentation, and the industry analysis sources.</w:t>
       </w:r>
     </w:p>
     <w:p>

</xml_diff>